<commit_message>
feat(4J/1J/3J): finalize Energy & Buildings submission package, Figure 1 workflow, graphical abstract, and manager prompts
</commit_message>
<xml_diff>
--- a/4J_docs_occ/writing/submission/4J_supplementary_material.docx
+++ b/4J_docs_occ/writing/submission/4J_supplementary_material.docx
@@ -7999,7 +7999,7 @@
         <w:t xml:space="preserve"> </w:t>
       </w:r>
       <w:r>
-        <w:t xml:space="preserve">Madrid, 840 cells in 84 buildings did not complete and were not repaired. Three courtyard buildings in</w:t>
+        <w:t xml:space="preserve">Madrid, 170 cells in 17 buildings did not complete and were not repaired. Three courtyard buildings in</w:t>
       </w:r>
       <w:r>
         <w:t xml:space="preserve"> </w:t>
@@ -9006,7 +9006,7 @@
         <w:t xml:space="preserve"> </w:t>
       </w:r>
       <w:r>
-        <w:t xml:space="preserve">it is used (S9). In Madrid, 840 cells in 84 buildings did not complete, and three courtyard buildings in</w:t>
+        <w:t xml:space="preserve">it is used (S9). In Madrid, 170 cells in 17 buildings did not complete, and three courtyard buildings in</w:t>
       </w:r>
       <w:r>
         <w:t xml:space="preserve"> </w:t>

</xml_diff>